<commit_message>
Fix reproducibility: reset DB per run + canonical numbers + IJIES paper
- Phase 2: add clear_database() using CREATE OR REPLACE DATABASE so each run
  starts from an empty graph. Fixes relationship count/frequency inflation
  (FAILED_LOGIN sum had ballooned to ~9.6M across re-runs); canonical
  failure_ratio now ~120 instead of ~957. Avoids OOM/deadlock from Cypher
  DETACH DELETE on memory-constrained instances.
- Add generate_paper_ijies.py: IJIES-formatted draft paper (two-column, TNR),
  with all ablation tables/metrics computed dynamically from canonical data.
- pipeline_adaudit.ipynb: add 7-configuration ensemble ablation with accuracy
  metrics (incl. IF+EE) + sensitivity analysis; correct narrative to canonical
  findings (EE highest vs rule-biased proxy; ensemble never worst = robust).
- Regenerate report v3 + paper with canonical numbers.
- gitignore third-party IJIES template.
</commit_message>
<xml_diff>
--- a/output/AD_Anomaly_Detection_Report_v3.docx
+++ b/output/AD_Anomaly_Detection_Report_v3.docx
@@ -265,7 +265,7 @@
         <w:rPr>
           <w:sz w:val="22"/>
         </w:rPr>
-        <w:t>Mean: 0.1774 | Median: 0.2014</w:t>
+        <w:t>Mean: 0.1650 | Median: 0.2003</w:t>
       </w:r>
     </w:p>
     <w:p>
@@ -277,7 +277,7 @@
         <w:rPr>
           <w:sz w:val="22"/>
         </w:rPr>
-        <w:t>Min: 0.0333 | Max: 0.6800</w:t>
+        <w:t>Min: 0.0337 | Max: 0.6400</w:t>
       </w:r>
     </w:p>
     <w:p/>
@@ -308,7 +308,7 @@
         <w:rPr>
           <w:sz w:val="22"/>
         </w:rPr>
-        <w:t>mti.admin - Score 0.6800 (CRITICAL) - 7/10 rules - 3/3 votes - Top cause: Rasio login gagal</w:t>
+        <w:t>mti.admin - Score 0.6400 (CRITICAL) - 6/10 rules - 3/3 votes - Top cause: Sering lockout</w:t>
       </w:r>
     </w:p>
     <w:p>
@@ -952,7 +952,7 @@
         <w:rPr>
           <w:sz w:val="22"/>
         </w:rPr>
-        <w:t>0 violation: 158 | 1-2: 77 | 3+: 652</w:t>
+        <w:t>0 violation: 165 | 1-2: 125 | 3+: 597</w:t>
       </w:r>
     </w:p>
     <w:p>
@@ -964,7 +964,7 @@
         <w:rPr>
           <w:sz w:val="22"/>
         </w:rPr>
-        <w:t>Rata-rata: 3.71 violations per user</w:t>
+        <w:t>Rata-rata: 3.39 violations per user</w:t>
       </w:r>
     </w:p>
     <w:p>
@@ -1039,7 +1039,7 @@
         <w:rPr>
           <w:sz w:val="22"/>
         </w:rPr>
-        <w:t>Distribusi anomaly score heavy-tailed (min=0.033, max=0.680, mean=0.177)</w:t>
+        <w:t>Distribusi anomaly score heavy-tailed (min=0.034, max=0.640, mean=0.165)</w:t>
       </w:r>
     </w:p>
     <w:p>
@@ -1179,7 +1179,7 @@
               <w:rPr>
                 <w:sz w:val="18"/>
               </w:rPr>
-              <w:t>&gt;= 0.3696</w:t>
+              <w:t>&gt;= 0.3580</w:t>
             </w:r>
           </w:p>
         </w:tc>
@@ -1239,7 +1239,7 @@
               <w:rPr>
                 <w:sz w:val="18"/>
               </w:rPr>
-              <w:t>&gt;= 0.3028</w:t>
+              <w:t>&gt;= 0.2916</w:t>
             </w:r>
           </w:p>
         </w:tc>
@@ -1299,7 +1299,7 @@
               <w:rPr>
                 <w:sz w:val="18"/>
               </w:rPr>
-              <w:t>&gt;= 0.2676</w:t>
+              <w:t>&gt;= 0.2377</w:t>
             </w:r>
           </w:p>
         </w:tc>
@@ -1359,7 +1359,7 @@
               <w:rPr>
                 <w:sz w:val="18"/>
               </w:rPr>
-              <w:t>&gt;= 0.2314</w:t>
+              <w:t>&gt;= 0.2095</w:t>
             </w:r>
           </w:p>
         </w:tc>
@@ -1419,7 +1419,7 @@
               <w:rPr>
                 <w:sz w:val="18"/>
               </w:rPr>
-              <w:t>&lt; 0.2314</w:t>
+              <w:t>&lt; 0.2095</w:t>
             </w:r>
           </w:p>
         </w:tc>
@@ -1796,7 +1796,7 @@
       <w:r>
         <w:drawing>
           <wp:inline xmlns:a="http://schemas.openxmlformats.org/drawingml/2006/main" xmlns:pic="http://schemas.openxmlformats.org/drawingml/2006/picture">
-            <wp:extent cx="5943600" cy="2662154"/>
+            <wp:extent cx="5943600" cy="2660354"/>
             <wp:docPr id="5" name="Picture 5"/>
             <wp:cNvGraphicFramePr>
               <a:graphicFrameLocks noChangeAspect="1"/>
@@ -1817,7 +1817,7 @@
                   <pic:spPr>
                     <a:xfrm>
                       <a:off x="0" y="0"/>
-                      <a:ext cx="5943600" cy="2662154"/>
+                      <a:ext cx="5943600" cy="2660354"/>
                     </a:xfrm>
                     <a:prstGeom prst="rect"/>
                   </pic:spPr>
@@ -1982,7 +1982,7 @@
               <w:rPr>
                 <w:sz w:val="16"/>
               </w:rPr>
-              <w:t>0.6800</w:t>
+              <w:t>0.6400</w:t>
             </w:r>
           </w:p>
         </w:tc>
@@ -2012,7 +2012,7 @@
               <w:rPr>
                 <w:sz w:val="16"/>
               </w:rPr>
-              <w:t>7/10</w:t>
+              <w:t>6/10</w:t>
             </w:r>
           </w:p>
         </w:tc>
@@ -2026,7 +2026,7 @@
               <w:rPr>
                 <w:sz w:val="16"/>
               </w:rPr>
-              <w:t>Rasio login gagal</w:t>
+              <w:t>Sering lockout</w:t>
             </w:r>
           </w:p>
         </w:tc>
@@ -2057,7 +2057,7 @@
               <w:rPr>
                 <w:sz w:val="16"/>
               </w:rPr>
-              <w:t>mti.sysadmin</w:t>
+              <w:t>andre.saputra</w:t>
             </w:r>
           </w:p>
         </w:tc>
@@ -2071,7 +2071,7 @@
               <w:rPr>
                 <w:sz w:val="16"/>
               </w:rPr>
-              <w:t>0.4346</w:t>
+              <w:t>0.3925</w:t>
             </w:r>
           </w:p>
         </w:tc>
@@ -2146,7 +2146,7 @@
               <w:rPr>
                 <w:sz w:val="16"/>
               </w:rPr>
-              <w:t>mti.chemicalanalyst</w:t>
+              <w:t>mahathir.muhammad</w:t>
             </w:r>
           </w:p>
         </w:tc>
@@ -2160,7 +2160,7 @@
               <w:rPr>
                 <w:sz w:val="16"/>
               </w:rPr>
-              <w:t>0.4026</w:t>
+              <w:t>0.3914</w:t>
             </w:r>
           </w:p>
         </w:tc>
@@ -2190,7 +2190,7 @@
               <w:rPr>
                 <w:sz w:val="16"/>
               </w:rPr>
-              <w:t>7/10</w:t>
+              <w:t>6/10</w:t>
             </w:r>
           </w:p>
         </w:tc>
@@ -2204,7 +2204,7 @@
               <w:rPr>
                 <w:sz w:val="16"/>
               </w:rPr>
-              <w:t>Rasio login gagal</w:t>
+              <w:t>Banyak admin action</w:t>
             </w:r>
           </w:p>
         </w:tc>
@@ -2235,7 +2235,7 @@
               <w:rPr>
                 <w:sz w:val="16"/>
               </w:rPr>
-              <w:t>aini.rosyidah</w:t>
+              <w:t>mti.sysadmin</w:t>
             </w:r>
           </w:p>
         </w:tc>
@@ -2249,363 +2249,7 @@
               <w:rPr>
                 <w:sz w:val="16"/>
               </w:rPr>
-              <w:t>0.4006</w:t>
-            </w:r>
-          </w:p>
-        </w:tc>
-        <w:tc>
-          <w:tcPr>
-            <w:tcW w:type="dxa" w:w="1568"/>
-            <w:shd w:val="clear" w:color="auto" w:fill="B71C1C"/>
-          </w:tcPr>
-          <w:p>
-            <w:r>
-              <w:rPr>
-                <w:b/>
-                <w:color w:val="FFFFFF"/>
-                <w:sz w:val="16"/>
-              </w:rPr>
-              <w:t>CRITICAL</w:t>
-            </w:r>
-          </w:p>
-        </w:tc>
-        <w:tc>
-          <w:tcPr>
-            <w:tcW w:type="dxa" w:w="1568"/>
-            <w:shd w:val="clear" w:color="auto" w:fill="F9FAFF"/>
-          </w:tcPr>
-          <w:p>
-            <w:r>
-              <w:rPr>
-                <w:sz w:val="16"/>
-              </w:rPr>
-              <w:t>7/10</w:t>
-            </w:r>
-          </w:p>
-        </w:tc>
-        <w:tc>
-          <w:tcPr>
-            <w:tcW w:type="dxa" w:w="1568"/>
-            <w:shd w:val="clear" w:color="auto" w:fill="F9FAFF"/>
-          </w:tcPr>
-          <w:p>
-            <w:r>
-              <w:rPr>
-                <w:sz w:val="16"/>
-              </w:rPr>
-              <w:t>Sering lockout</w:t>
-            </w:r>
-          </w:p>
-        </w:tc>
-      </w:tr>
-      <w:tr>
-        <w:tc>
-          <w:tcPr>
-            <w:tcW w:type="dxa" w:w="1568"/>
-            <w:shd w:val="clear" w:color="auto" w:fill="EEF4FF"/>
-          </w:tcPr>
-          <w:p>
-            <w:r>
-              <w:rPr>
-                <w:b/>
-                <w:sz w:val="16"/>
-              </w:rPr>
-              <w:t>5</w:t>
-            </w:r>
-          </w:p>
-        </w:tc>
-        <w:tc>
-          <w:tcPr>
-            <w:tcW w:type="dxa" w:w="1568"/>
-            <w:shd w:val="clear" w:color="auto" w:fill="EEF4FF"/>
-          </w:tcPr>
-          <w:p>
-            <w:r>
-              <w:rPr>
-                <w:sz w:val="16"/>
-              </w:rPr>
-              <w:t>andre.saputra</w:t>
-            </w:r>
-          </w:p>
-        </w:tc>
-        <w:tc>
-          <w:tcPr>
-            <w:tcW w:type="dxa" w:w="1568"/>
-            <w:shd w:val="clear" w:color="auto" w:fill="EEF4FF"/>
-          </w:tcPr>
-          <w:p>
-            <w:r>
-              <w:rPr>
-                <w:sz w:val="16"/>
-              </w:rPr>
-              <w:t>0.3845</w:t>
-            </w:r>
-          </w:p>
-        </w:tc>
-        <w:tc>
-          <w:tcPr>
-            <w:tcW w:type="dxa" w:w="1568"/>
-            <w:shd w:val="clear" w:color="auto" w:fill="B71C1C"/>
-          </w:tcPr>
-          <w:p>
-            <w:r>
-              <w:rPr>
-                <w:b/>
-                <w:color w:val="FFFFFF"/>
-                <w:sz w:val="16"/>
-              </w:rPr>
-              <w:t>CRITICAL</w:t>
-            </w:r>
-          </w:p>
-        </w:tc>
-        <w:tc>
-          <w:tcPr>
-            <w:tcW w:type="dxa" w:w="1568"/>
-            <w:shd w:val="clear" w:color="auto" w:fill="EEF4FF"/>
-          </w:tcPr>
-          <w:p>
-            <w:r>
-              <w:rPr>
-                <w:sz w:val="16"/>
-              </w:rPr>
-              <w:t>7/10</w:t>
-            </w:r>
-          </w:p>
-        </w:tc>
-        <w:tc>
-          <w:tcPr>
-            <w:tcW w:type="dxa" w:w="1568"/>
-            <w:shd w:val="clear" w:color="auto" w:fill="EEF4FF"/>
-          </w:tcPr>
-          <w:p>
-            <w:r>
-              <w:rPr>
-                <w:sz w:val="16"/>
-              </w:rPr>
-              <w:t>Banyak admin action</w:t>
-            </w:r>
-          </w:p>
-        </w:tc>
-      </w:tr>
-      <w:tr>
-        <w:tc>
-          <w:tcPr>
-            <w:tcW w:type="dxa" w:w="1568"/>
-            <w:shd w:val="clear" w:color="auto" w:fill="F9FAFF"/>
-          </w:tcPr>
-          <w:p>
-            <w:r>
-              <w:rPr>
-                <w:b/>
-                <w:sz w:val="16"/>
-              </w:rPr>
-              <w:t>6</w:t>
-            </w:r>
-          </w:p>
-        </w:tc>
-        <w:tc>
-          <w:tcPr>
-            <w:tcW w:type="dxa" w:w="1568"/>
-            <w:shd w:val="clear" w:color="auto" w:fill="F9FAFF"/>
-          </w:tcPr>
-          <w:p>
-            <w:r>
-              <w:rPr>
-                <w:sz w:val="16"/>
-              </w:rPr>
-              <w:t>dwiki.hernanto</w:t>
-            </w:r>
-          </w:p>
-        </w:tc>
-        <w:tc>
-          <w:tcPr>
-            <w:tcW w:type="dxa" w:w="1568"/>
-            <w:shd w:val="clear" w:color="auto" w:fill="F9FAFF"/>
-          </w:tcPr>
-          <w:p>
-            <w:r>
-              <w:rPr>
-                <w:sz w:val="16"/>
-              </w:rPr>
-              <w:t>0.3833</w:t>
-            </w:r>
-          </w:p>
-        </w:tc>
-        <w:tc>
-          <w:tcPr>
-            <w:tcW w:type="dxa" w:w="1568"/>
-            <w:shd w:val="clear" w:color="auto" w:fill="B71C1C"/>
-          </w:tcPr>
-          <w:p>
-            <w:r>
-              <w:rPr>
-                <w:b/>
-                <w:color w:val="FFFFFF"/>
-                <w:sz w:val="16"/>
-              </w:rPr>
-              <w:t>CRITICAL</w:t>
-            </w:r>
-          </w:p>
-        </w:tc>
-        <w:tc>
-          <w:tcPr>
-            <w:tcW w:type="dxa" w:w="1568"/>
-            <w:shd w:val="clear" w:color="auto" w:fill="F9FAFF"/>
-          </w:tcPr>
-          <w:p>
-            <w:r>
-              <w:rPr>
-                <w:sz w:val="16"/>
-              </w:rPr>
-              <w:t>7/10</w:t>
-            </w:r>
-          </w:p>
-        </w:tc>
-        <w:tc>
-          <w:tcPr>
-            <w:tcW w:type="dxa" w:w="1568"/>
-            <w:shd w:val="clear" w:color="auto" w:fill="F9FAFF"/>
-          </w:tcPr>
-          <w:p>
-            <w:r>
-              <w:rPr>
-                <w:sz w:val="16"/>
-              </w:rPr>
-              <w:t>Rasio login gagal</w:t>
-            </w:r>
-          </w:p>
-        </w:tc>
-      </w:tr>
-      <w:tr>
-        <w:tc>
-          <w:tcPr>
-            <w:tcW w:type="dxa" w:w="1568"/>
-            <w:shd w:val="clear" w:color="auto" w:fill="EEF4FF"/>
-          </w:tcPr>
-          <w:p>
-            <w:r>
-              <w:rPr>
-                <w:b/>
-                <w:sz w:val="16"/>
-              </w:rPr>
-              <w:t>7</w:t>
-            </w:r>
-          </w:p>
-        </w:tc>
-        <w:tc>
-          <w:tcPr>
-            <w:tcW w:type="dxa" w:w="1568"/>
-            <w:shd w:val="clear" w:color="auto" w:fill="EEF4FF"/>
-          </w:tcPr>
-          <w:p>
-            <w:r>
-              <w:rPr>
-                <w:sz w:val="16"/>
-              </w:rPr>
-              <w:t>peggy.putra</w:t>
-            </w:r>
-          </w:p>
-        </w:tc>
-        <w:tc>
-          <w:tcPr>
-            <w:tcW w:type="dxa" w:w="1568"/>
-            <w:shd w:val="clear" w:color="auto" w:fill="EEF4FF"/>
-          </w:tcPr>
-          <w:p>
-            <w:r>
-              <w:rPr>
-                <w:sz w:val="16"/>
-              </w:rPr>
-              <w:t>0.3819</w:t>
-            </w:r>
-          </w:p>
-        </w:tc>
-        <w:tc>
-          <w:tcPr>
-            <w:tcW w:type="dxa" w:w="1568"/>
-            <w:shd w:val="clear" w:color="auto" w:fill="B71C1C"/>
-          </w:tcPr>
-          <w:p>
-            <w:r>
-              <w:rPr>
-                <w:b/>
-                <w:color w:val="FFFFFF"/>
-                <w:sz w:val="16"/>
-              </w:rPr>
-              <w:t>CRITICAL</w:t>
-            </w:r>
-          </w:p>
-        </w:tc>
-        <w:tc>
-          <w:tcPr>
-            <w:tcW w:type="dxa" w:w="1568"/>
-            <w:shd w:val="clear" w:color="auto" w:fill="EEF4FF"/>
-          </w:tcPr>
-          <w:p>
-            <w:r>
-              <w:rPr>
-                <w:sz w:val="16"/>
-              </w:rPr>
-              <w:t>7/10</w:t>
-            </w:r>
-          </w:p>
-        </w:tc>
-        <w:tc>
-          <w:tcPr>
-            <w:tcW w:type="dxa" w:w="1568"/>
-            <w:shd w:val="clear" w:color="auto" w:fill="EEF4FF"/>
-          </w:tcPr>
-          <w:p>
-            <w:r>
-              <w:rPr>
-                <w:sz w:val="16"/>
-              </w:rPr>
-              <w:t>Banyak admin action</w:t>
-            </w:r>
-          </w:p>
-        </w:tc>
-      </w:tr>
-      <w:tr>
-        <w:tc>
-          <w:tcPr>
-            <w:tcW w:type="dxa" w:w="1568"/>
-            <w:shd w:val="clear" w:color="auto" w:fill="F9FAFF"/>
-          </w:tcPr>
-          <w:p>
-            <w:r>
-              <w:rPr>
-                <w:b/>
-                <w:sz w:val="16"/>
-              </w:rPr>
-              <w:t>8</w:t>
-            </w:r>
-          </w:p>
-        </w:tc>
-        <w:tc>
-          <w:tcPr>
-            <w:tcW w:type="dxa" w:w="1568"/>
-            <w:shd w:val="clear" w:color="auto" w:fill="F9FAFF"/>
-          </w:tcPr>
-          <w:p>
-            <w:r>
-              <w:rPr>
-                <w:sz w:val="16"/>
-              </w:rPr>
-              <w:t>mahathir.muhammad</w:t>
-            </w:r>
-          </w:p>
-        </w:tc>
-        <w:tc>
-          <w:tcPr>
-            <w:tcW w:type="dxa" w:w="1568"/>
-            <w:shd w:val="clear" w:color="auto" w:fill="F9FAFF"/>
-          </w:tcPr>
-          <w:p>
-            <w:r>
-              <w:rPr>
-                <w:sz w:val="16"/>
-              </w:rPr>
-              <w:t>0.3817</w:t>
+              <w:t>0.3911</w:t>
             </w:r>
           </w:p>
         </w:tc>
@@ -2666,7 +2310,7 @@
                 <w:b/>
                 <w:sz w:val="16"/>
               </w:rPr>
-              <w:t>9</w:t>
+              <w:t>5</w:t>
             </w:r>
           </w:p>
         </w:tc>
@@ -2694,7 +2338,363 @@
               <w:rPr>
                 <w:sz w:val="16"/>
               </w:rPr>
-              <w:t>0.3749</w:t>
+              <w:t>0.3740</w:t>
+            </w:r>
+          </w:p>
+        </w:tc>
+        <w:tc>
+          <w:tcPr>
+            <w:tcW w:type="dxa" w:w="1568"/>
+            <w:shd w:val="clear" w:color="auto" w:fill="B71C1C"/>
+          </w:tcPr>
+          <w:p>
+            <w:r>
+              <w:rPr>
+                <w:b/>
+                <w:color w:val="FFFFFF"/>
+                <w:sz w:val="16"/>
+              </w:rPr>
+              <w:t>CRITICAL</w:t>
+            </w:r>
+          </w:p>
+        </w:tc>
+        <w:tc>
+          <w:tcPr>
+            <w:tcW w:type="dxa" w:w="1568"/>
+            <w:shd w:val="clear" w:color="auto" w:fill="EEF4FF"/>
+          </w:tcPr>
+          <w:p>
+            <w:r>
+              <w:rPr>
+                <w:sz w:val="16"/>
+              </w:rPr>
+              <w:t>6/10</w:t>
+            </w:r>
+          </w:p>
+        </w:tc>
+        <w:tc>
+          <w:tcPr>
+            <w:tcW w:type="dxa" w:w="1568"/>
+            <w:shd w:val="clear" w:color="auto" w:fill="EEF4FF"/>
+          </w:tcPr>
+          <w:p>
+            <w:r>
+              <w:rPr>
+                <w:sz w:val="16"/>
+              </w:rPr>
+              <w:t>Sering lockout</w:t>
+            </w:r>
+          </w:p>
+        </w:tc>
+      </w:tr>
+      <w:tr>
+        <w:tc>
+          <w:tcPr>
+            <w:tcW w:type="dxa" w:w="1568"/>
+            <w:shd w:val="clear" w:color="auto" w:fill="F9FAFF"/>
+          </w:tcPr>
+          <w:p>
+            <w:r>
+              <w:rPr>
+                <w:b/>
+                <w:sz w:val="16"/>
+              </w:rPr>
+              <w:t>6</w:t>
+            </w:r>
+          </w:p>
+        </w:tc>
+        <w:tc>
+          <w:tcPr>
+            <w:tcW w:type="dxa" w:w="1568"/>
+            <w:shd w:val="clear" w:color="auto" w:fill="F9FAFF"/>
+          </w:tcPr>
+          <w:p>
+            <w:r>
+              <w:rPr>
+                <w:sz w:val="16"/>
+              </w:rPr>
+              <w:t>ricky.rediansyah</w:t>
+            </w:r>
+          </w:p>
+        </w:tc>
+        <w:tc>
+          <w:tcPr>
+            <w:tcW w:type="dxa" w:w="1568"/>
+            <w:shd w:val="clear" w:color="auto" w:fill="F9FAFF"/>
+          </w:tcPr>
+          <w:p>
+            <w:r>
+              <w:rPr>
+                <w:sz w:val="16"/>
+              </w:rPr>
+              <w:t>0.3662</w:t>
+            </w:r>
+          </w:p>
+        </w:tc>
+        <w:tc>
+          <w:tcPr>
+            <w:tcW w:type="dxa" w:w="1568"/>
+            <w:shd w:val="clear" w:color="auto" w:fill="B71C1C"/>
+          </w:tcPr>
+          <w:p>
+            <w:r>
+              <w:rPr>
+                <w:b/>
+                <w:color w:val="FFFFFF"/>
+                <w:sz w:val="16"/>
+              </w:rPr>
+              <w:t>CRITICAL</w:t>
+            </w:r>
+          </w:p>
+        </w:tc>
+        <w:tc>
+          <w:tcPr>
+            <w:tcW w:type="dxa" w:w="1568"/>
+            <w:shd w:val="clear" w:color="auto" w:fill="F9FAFF"/>
+          </w:tcPr>
+          <w:p>
+            <w:r>
+              <w:rPr>
+                <w:sz w:val="16"/>
+              </w:rPr>
+              <w:t>1/10</w:t>
+            </w:r>
+          </w:p>
+        </w:tc>
+        <w:tc>
+          <w:tcPr>
+            <w:tcW w:type="dxa" w:w="1568"/>
+            <w:shd w:val="clear" w:color="auto" w:fill="F9FAFF"/>
+          </w:tcPr>
+          <w:p>
+            <w:r>
+              <w:rPr>
+                <w:sz w:val="16"/>
+              </w:rPr>
+              <w:t>Sering lockout</w:t>
+            </w:r>
+          </w:p>
+        </w:tc>
+      </w:tr>
+      <w:tr>
+        <w:tc>
+          <w:tcPr>
+            <w:tcW w:type="dxa" w:w="1568"/>
+            <w:shd w:val="clear" w:color="auto" w:fill="EEF4FF"/>
+          </w:tcPr>
+          <w:p>
+            <w:r>
+              <w:rPr>
+                <w:b/>
+                <w:sz w:val="16"/>
+              </w:rPr>
+              <w:t>7</w:t>
+            </w:r>
+          </w:p>
+        </w:tc>
+        <w:tc>
+          <w:tcPr>
+            <w:tcW w:type="dxa" w:w="1568"/>
+            <w:shd w:val="clear" w:color="auto" w:fill="EEF4FF"/>
+          </w:tcPr>
+          <w:p>
+            <w:r>
+              <w:rPr>
+                <w:sz w:val="16"/>
+              </w:rPr>
+              <w:t>muhammad.firmansyah</w:t>
+            </w:r>
+          </w:p>
+        </w:tc>
+        <w:tc>
+          <w:tcPr>
+            <w:tcW w:type="dxa" w:w="1568"/>
+            <w:shd w:val="clear" w:color="auto" w:fill="EEF4FF"/>
+          </w:tcPr>
+          <w:p>
+            <w:r>
+              <w:rPr>
+                <w:sz w:val="16"/>
+              </w:rPr>
+              <w:t>0.3644</w:t>
+            </w:r>
+          </w:p>
+        </w:tc>
+        <w:tc>
+          <w:tcPr>
+            <w:tcW w:type="dxa" w:w="1568"/>
+            <w:shd w:val="clear" w:color="auto" w:fill="B71C1C"/>
+          </w:tcPr>
+          <w:p>
+            <w:r>
+              <w:rPr>
+                <w:b/>
+                <w:color w:val="FFFFFF"/>
+                <w:sz w:val="16"/>
+              </w:rPr>
+              <w:t>CRITICAL</w:t>
+            </w:r>
+          </w:p>
+        </w:tc>
+        <w:tc>
+          <w:tcPr>
+            <w:tcW w:type="dxa" w:w="1568"/>
+            <w:shd w:val="clear" w:color="auto" w:fill="EEF4FF"/>
+          </w:tcPr>
+          <w:p>
+            <w:r>
+              <w:rPr>
+                <w:sz w:val="16"/>
+              </w:rPr>
+              <w:t>1/10</w:t>
+            </w:r>
+          </w:p>
+        </w:tc>
+        <w:tc>
+          <w:tcPr>
+            <w:tcW w:type="dxa" w:w="1568"/>
+            <w:shd w:val="clear" w:color="auto" w:fill="EEF4FF"/>
+          </w:tcPr>
+          <w:p>
+            <w:r>
+              <w:rPr>
+                <w:sz w:val="16"/>
+              </w:rPr>
+              <w:t>Sering lockout</w:t>
+            </w:r>
+          </w:p>
+        </w:tc>
+      </w:tr>
+      <w:tr>
+        <w:tc>
+          <w:tcPr>
+            <w:tcW w:type="dxa" w:w="1568"/>
+            <w:shd w:val="clear" w:color="auto" w:fill="F9FAFF"/>
+          </w:tcPr>
+          <w:p>
+            <w:r>
+              <w:rPr>
+                <w:b/>
+                <w:sz w:val="16"/>
+              </w:rPr>
+              <w:t>8</w:t>
+            </w:r>
+          </w:p>
+        </w:tc>
+        <w:tc>
+          <w:tcPr>
+            <w:tcW w:type="dxa" w:w="1568"/>
+            <w:shd w:val="clear" w:color="auto" w:fill="F9FAFF"/>
+          </w:tcPr>
+          <w:p>
+            <w:r>
+              <w:rPr>
+                <w:sz w:val="16"/>
+              </w:rPr>
+              <w:t>mti.chemicalanalyst</w:t>
+            </w:r>
+          </w:p>
+        </w:tc>
+        <w:tc>
+          <w:tcPr>
+            <w:tcW w:type="dxa" w:w="1568"/>
+            <w:shd w:val="clear" w:color="auto" w:fill="F9FAFF"/>
+          </w:tcPr>
+          <w:p>
+            <w:r>
+              <w:rPr>
+                <w:sz w:val="16"/>
+              </w:rPr>
+              <w:t>0.3643</w:t>
+            </w:r>
+          </w:p>
+        </w:tc>
+        <w:tc>
+          <w:tcPr>
+            <w:tcW w:type="dxa" w:w="1568"/>
+            <w:shd w:val="clear" w:color="auto" w:fill="B71C1C"/>
+          </w:tcPr>
+          <w:p>
+            <w:r>
+              <w:rPr>
+                <w:b/>
+                <w:color w:val="FFFFFF"/>
+                <w:sz w:val="16"/>
+              </w:rPr>
+              <w:t>CRITICAL</w:t>
+            </w:r>
+          </w:p>
+        </w:tc>
+        <w:tc>
+          <w:tcPr>
+            <w:tcW w:type="dxa" w:w="1568"/>
+            <w:shd w:val="clear" w:color="auto" w:fill="F9FAFF"/>
+          </w:tcPr>
+          <w:p>
+            <w:r>
+              <w:rPr>
+                <w:sz w:val="16"/>
+              </w:rPr>
+              <w:t>6/10</w:t>
+            </w:r>
+          </w:p>
+        </w:tc>
+        <w:tc>
+          <w:tcPr>
+            <w:tcW w:type="dxa" w:w="1568"/>
+            <w:shd w:val="clear" w:color="auto" w:fill="F9FAFF"/>
+          </w:tcPr>
+          <w:p>
+            <w:r>
+              <w:rPr>
+                <w:sz w:val="16"/>
+              </w:rPr>
+              <w:t>Rasio login gagal</w:t>
+            </w:r>
+          </w:p>
+        </w:tc>
+      </w:tr>
+      <w:tr>
+        <w:tc>
+          <w:tcPr>
+            <w:tcW w:type="dxa" w:w="1568"/>
+            <w:shd w:val="clear" w:color="auto" w:fill="EEF4FF"/>
+          </w:tcPr>
+          <w:p>
+            <w:r>
+              <w:rPr>
+                <w:b/>
+                <w:sz w:val="16"/>
+              </w:rPr>
+              <w:t>9</w:t>
+            </w:r>
+          </w:p>
+        </w:tc>
+        <w:tc>
+          <w:tcPr>
+            <w:tcW w:type="dxa" w:w="1568"/>
+            <w:shd w:val="clear" w:color="auto" w:fill="EEF4FF"/>
+          </w:tcPr>
+          <w:p>
+            <w:r>
+              <w:rPr>
+                <w:sz w:val="16"/>
+              </w:rPr>
+              <w:t>ss.admin</w:t>
+            </w:r>
+          </w:p>
+        </w:tc>
+        <w:tc>
+          <w:tcPr>
+            <w:tcW w:type="dxa" w:w="1568"/>
+            <w:shd w:val="clear" w:color="auto" w:fill="EEF4FF"/>
+          </w:tcPr>
+          <w:p>
+            <w:r>
+              <w:rPr>
+                <w:sz w:val="16"/>
+              </w:rPr>
+              <w:t>0.3608</w:t>
             </w:r>
           </w:p>
         </w:tc>
@@ -2769,7 +2769,7 @@
               <w:rPr>
                 <w:sz w:val="16"/>
               </w:rPr>
-              <w:t>jeremi.manurung</w:t>
+              <w:t>mti.cctv</w:t>
             </w:r>
           </w:p>
         </w:tc>
@@ -2783,7 +2783,7 @@
               <w:rPr>
                 <w:sz w:val="16"/>
               </w:rPr>
-              <w:t>0.3687</w:t>
+              <w:t>0.3576</w:t>
             </w:r>
           </w:p>
         </w:tc>
@@ -2813,7 +2813,7 @@
               <w:rPr>
                 <w:sz w:val="16"/>
               </w:rPr>
-              <w:t>7/10</w:t>
+              <w:t>6/10</w:t>
             </w:r>
           </w:p>
         </w:tc>
@@ -3096,7 +3096,7 @@
               <w:rPr>
                 <w:sz w:val="18"/>
               </w:rPr>
-              <w:t>0.3846</w:t>
+              <w:t>0.3433</w:t>
             </w:r>
           </w:p>
         </w:tc>
@@ -3110,7 +3110,7 @@
               <w:rPr>
                 <w:sz w:val="18"/>
               </w:rPr>
-              <w:t>0.5318</w:t>
+              <w:t>0.4850</w:t>
             </w:r>
           </w:p>
         </w:tc>
@@ -3156,7 +3156,7 @@
               <w:rPr>
                 <w:sz w:val="18"/>
               </w:rPr>
-              <w:t>0.4754</w:t>
+              <w:t>0.5517</w:t>
             </w:r>
           </w:p>
         </w:tc>
@@ -3170,7 +3170,7 @@
               <w:rPr>
                 <w:sz w:val="18"/>
               </w:rPr>
-              <w:t>0.6254</w:t>
+              <w:t>0.6957</w:t>
             </w:r>
           </w:p>
         </w:tc>
@@ -3216,7 +3216,7 @@
               <w:rPr>
                 <w:sz w:val="18"/>
               </w:rPr>
-              <w:t>0.1392</w:t>
+              <w:t>0.1250</w:t>
             </w:r>
           </w:p>
         </w:tc>
@@ -3230,7 +3230,7 @@
               <w:rPr>
                 <w:sz w:val="18"/>
               </w:rPr>
-              <w:t>0.2041</w:t>
+              <w:t>0.1807</w:t>
             </w:r>
           </w:p>
         </w:tc>
@@ -3244,7 +3244,7 @@
               <w:rPr>
                 <w:sz w:val="18"/>
               </w:rPr>
-              <w:t>fair</w:t>
+              <w:t>rendah</w:t>
             </w:r>
           </w:p>
         </w:tc>
@@ -3473,7 +3473,7 @@
               <w:rPr>
                 <w:sz w:val="18"/>
               </w:rPr>
-              <w:t>0.2889</w:t>
+              <w:t>0.3333</w:t>
             </w:r>
           </w:p>
         </w:tc>
@@ -3487,7 +3487,7 @@
               <w:rPr>
                 <w:sz w:val="18"/>
               </w:rPr>
-              <w:t>3.29</w:t>
+              <w:t>3.33</w:t>
             </w:r>
           </w:p>
         </w:tc>
@@ -3547,7 +3547,7 @@
               <w:rPr>
                 <w:sz w:val="18"/>
               </w:rPr>
-              <w:t>0.0667</w:t>
+              <w:t>0.0444</w:t>
             </w:r>
           </w:p>
         </w:tc>
@@ -3561,7 +3561,7 @@
               <w:rPr>
                 <w:sz w:val="18"/>
               </w:rPr>
-              <w:t>1.07</w:t>
+              <w:t>0.73</w:t>
             </w:r>
           </w:p>
         </w:tc>
@@ -3575,7 +3575,7 @@
               <w:rPr>
                 <w:sz w:val="18"/>
               </w:rPr>
-              <w:t>0.1642</w:t>
+              <w:t>0.1465</w:t>
             </w:r>
           </w:p>
         </w:tc>
@@ -3621,7 +3621,7 @@
               <w:rPr>
                 <w:sz w:val="18"/>
               </w:rPr>
-              <w:t>0.5778</w:t>
+              <w:t>0.5333</w:t>
             </w:r>
           </w:p>
         </w:tc>
@@ -3635,7 +3635,7 @@
               <w:rPr>
                 <w:sz w:val="18"/>
               </w:rPr>
-              <w:t>5.18</w:t>
+              <w:t>4.87</w:t>
             </w:r>
           </w:p>
         </w:tc>
@@ -3649,7 +3649,7 @@
               <w:rPr>
                 <w:sz w:val="18"/>
               </w:rPr>
-              <w:t>0.3188</w:t>
+              <w:t>0.3139</w:t>
             </w:r>
           </w:p>
         </w:tc>
@@ -3695,7 +3695,7 @@
               <w:rPr>
                 <w:sz w:val="18"/>
               </w:rPr>
-              <w:t>0.3111</w:t>
+              <w:t>0.3333</w:t>
             </w:r>
           </w:p>
         </w:tc>
@@ -3709,7 +3709,7 @@
               <w:rPr>
                 <w:sz w:val="18"/>
               </w:rPr>
-              <w:t>3.42</w:t>
+              <w:t>3.33</w:t>
             </w:r>
           </w:p>
         </w:tc>
@@ -3723,7 +3723,7 @@
               <w:rPr>
                 <w:sz w:val="18"/>
               </w:rPr>
-              <w:t>0.2770</w:t>
+              <w:t>0.2717</w:t>
             </w:r>
           </w:p>
         </w:tc>
@@ -3739,7 +3739,7 @@
         <w:rPr>
           <w:sz w:val="22"/>
         </w:rPr>
-        <w:t>Baseline populasi: Avg rule_viol = 3.71, Avg score = 0.1774</w:t>
+        <w:t>Baseline populasi: Avg rule_viol = 3.39, Avg score = 0.1650</w:t>
       </w:r>
     </w:p>
     <w:p/>
@@ -3906,7 +3906,7 @@
         <w:rPr>
           <w:sz w:val="22"/>
         </w:rPr>
-        <w:t>"Banyak admin action": 4 dari 10 anomali teratas</w:t>
+        <w:t>"Sering lockout": 6 dari 10 anomali teratas</w:t>
       </w:r>
     </w:p>
     <w:p>
@@ -3918,7 +3918,7 @@
         <w:rPr>
           <w:sz w:val="22"/>
         </w:rPr>
-        <w:t>"Rasio login gagal": 3 dari 10 anomali teratas</w:t>
+        <w:t>"Banyak admin action": 3 dari 10 anomali teratas</w:t>
       </w:r>
     </w:p>
     <w:p>
@@ -3930,7 +3930,7 @@
         <w:rPr>
           <w:sz w:val="22"/>
         </w:rPr>
-        <w:t>"Sering lockout": 3 dari 10 anomali teratas</w:t>
+        <w:t>"Rasio login gagal": 1 dari 10 anomali teratas</w:t>
       </w:r>
     </w:p>
     <w:p/>
@@ -4065,7 +4065,7 @@
         <w:rPr>
           <w:sz w:val="22"/>
         </w:rPr>
-        <w:t>Top user (mti.admin) - score 0.6800, 7/10 rules</w:t>
+        <w:t>Top user (mti.admin) - score 0.6400, 6/10 rules</w:t>
       </w:r>
     </w:p>
     <w:p>

</xml_diff>